<commit_message>
specs: the PHR V3 document leaves git, and the review documents lose their author fields
The PHR V3 document's examples carry sandbox testers' names, ABHA
addresses and signed tokens throughout, and the redaction committed
earlier missed them. It is no longer committed; the manifest records its
hash and says why. The six other documents carried NHA staff names and
emails in their file properties; those fields are cleared and their
hashes re-recorded. The ledger records the adversarial review that found
this.

Co-Authored-By: Claude Fable 5.1 <noreply@anthropic.com>
</commit_message>
<xml_diff>
--- a/catalogue/openapi/.raw/nha-2026-09-21-review/Milestone 4 Document.docx
+++ b/catalogue/openapi/.raw/nha-2026-09-21-review/Milestone 4 Document.docx
@@ -6354,7 +6354,7 @@
 
 <file path=word/comments.xml><?xml version="1.0" encoding="utf-8"?>
 <w:comments xmlns:wpc="http://schemas.microsoft.com/office/word/2010/wordprocessingCanvas" xmlns:cx="http://schemas.microsoft.com/office/drawing/2014/chartex" xmlns:cx1="http://schemas.microsoft.com/office/drawing/2015/9/8/chartex" xmlns:cx2="http://schemas.microsoft.com/office/drawing/2015/10/21/chartex" xmlns:cx3="http://schemas.microsoft.com/office/drawing/2016/5/9/chartex" xmlns:cx4="http://schemas.microsoft.com/office/drawing/2016/5/10/chartex" xmlns:cx5="http://schemas.microsoft.com/office/drawing/2016/5/11/chartex" xmlns:cx6="http://schemas.microsoft.com/office/drawing/2016/5/12/chartex" xmlns:cx7="http://schemas.microsoft.com/office/drawing/2016/5/13/chartex" xmlns:cx8="http://schemas.microsoft.com/office/drawing/2016/5/14/chartex" xmlns:mc="http://schemas.openxmlformats.org/markup-compatibility/2006" xmlns:aink="http://schemas.microsoft.com/office/drawing/2016/ink" xmlns:am3d="http://schemas.microsoft.com/office/drawing/2017/model3d" xmlns:o="urn:schemas-microsoft-com:office:office" xmlns:oel="http://schemas.microsoft.com/office/2019/extlst" xmlns:r="http://schemas.openxmlformats.org/officeDocument/2006/relationships" xmlns:m="http://schemas.openxmlformats.org/officeDocument/2006/math" xmlns:v="urn:schemas-microsoft-com:vml" xmlns:wp14="http://schemas.microsoft.com/office/word/2010/wordprocessingDrawing" xmlns:wp="http://schemas.openxmlformats.org/drawingml/2006/wordprocessingDrawing" xmlns:w10="urn:schemas-microsoft-com:office:word" xmlns:w="http://schemas.openxmlformats.org/wordprocessingml/2006/main" xmlns:w14="http://schemas.microsoft.com/office/word/2010/wordml" xmlns:w15="http://schemas.microsoft.com/office/word/2012/wordml" xmlns:w16cex="http://schemas.microsoft.com/office/word/2018/wordml/cex" xmlns:w16cid="http://schemas.microsoft.com/office/word/2016/wordml/cid" xmlns:w16="http://schemas.microsoft.com/office/word/2018/wordml" xmlns:w16du="http://schemas.microsoft.com/office/word/2023/wordml/word16du" xmlns:w16sdtdh="http://schemas.microsoft.com/office/word/2020/wordml/sdtdatahash" xmlns:w16sdtfl="http://schemas.microsoft.com/office/word/2024/wordml/sdtformatlock" xmlns:w16se="http://schemas.microsoft.com/office/word/2015/wordml/symex" xmlns:wpg="http://schemas.microsoft.com/office/word/2010/wordprocessingGroup" xmlns:wpi="http://schemas.microsoft.com/office/word/2010/wordprocessingInk" xmlns:wne="http://schemas.microsoft.com/office/word/2006/wordml" xmlns:wps="http://schemas.microsoft.com/office/word/2010/wordprocessingShape" mc:Ignorable="w14 w15 w16se w16cid w16 w16cex w16sdtdh w16sdtfl w16du wp14">
-  <w:comment w:id="0" w:author="Pooja.Bhat@NHAAD.IN" w:date="2026-09-15T13:16:00Z" w:initials="P">
+  <w:comment w:id="0" w:author="NHA" w:date="2026-09-15T13:16:00Z" w:initials="">
     <w:p>
       <w:pPr>
         <w:pStyle w:val="CommentText"/>
@@ -6370,7 +6370,7 @@
       </w:r>
     </w:p>
   </w:comment>
-  <w:comment w:id="1" w:author="Pooja.Bhat@NHAAD.IN" w:date="2026-09-15T13:18:00Z" w:initials="P">
+  <w:comment w:id="1" w:author="NHA" w:date="2026-09-15T13:18:00Z" w:initials="">
     <w:p>
       <w:pPr>
         <w:pStyle w:val="CommentText"/>
@@ -8841,7 +8841,7 @@
 
 <file path=word/people.xml><?xml version="1.0" encoding="utf-8"?>
 <w15:people xmlns:wpc="http://schemas.microsoft.com/office/word/2010/wordprocessingCanvas" xmlns:cx="http://schemas.microsoft.com/office/drawing/2014/chartex" xmlns:cx1="http://schemas.microsoft.com/office/drawing/2015/9/8/chartex" xmlns:cx2="http://schemas.microsoft.com/office/drawing/2015/10/21/chartex" xmlns:cx3="http://schemas.microsoft.com/office/drawing/2016/5/9/chartex" xmlns:cx4="http://schemas.microsoft.com/office/drawing/2016/5/10/chartex" xmlns:cx5="http://schemas.microsoft.com/office/drawing/2016/5/11/chartex" xmlns:cx6="http://schemas.microsoft.com/office/drawing/2016/5/12/chartex" xmlns:cx7="http://schemas.microsoft.com/office/drawing/2016/5/13/chartex" xmlns:cx8="http://schemas.microsoft.com/office/drawing/2016/5/14/chartex" xmlns:mc="http://schemas.openxmlformats.org/markup-compatibility/2006" xmlns:aink="http://schemas.microsoft.com/office/drawing/2016/ink" xmlns:am3d="http://schemas.microsoft.com/office/drawing/2017/model3d" xmlns:o="urn:schemas-microsoft-com:office:office" xmlns:oel="http://schemas.microsoft.com/office/2019/extlst" xmlns:r="http://schemas.openxmlformats.org/officeDocument/2006/relationships" xmlns:m="http://schemas.openxmlformats.org/officeDocument/2006/math" xmlns:v="urn:schemas-microsoft-com:vml" xmlns:wp14="http://schemas.microsoft.com/office/word/2010/wordprocessingDrawing" xmlns:wp="http://schemas.openxmlformats.org/drawingml/2006/wordprocessingDrawing" xmlns:w10="urn:schemas-microsoft-com:office:word" xmlns:w="http://schemas.openxmlformats.org/wordprocessingml/2006/main" xmlns:w14="http://schemas.microsoft.com/office/word/2010/wordml" xmlns:w15="http://schemas.microsoft.com/office/word/2012/wordml" xmlns:w16cex="http://schemas.microsoft.com/office/word/2018/wordml/cex" xmlns:w16cid="http://schemas.microsoft.com/office/word/2016/wordml/cid" xmlns:w16="http://schemas.microsoft.com/office/word/2018/wordml" xmlns:w16du="http://schemas.microsoft.com/office/word/2023/wordml/word16du" xmlns:w16sdtdh="http://schemas.microsoft.com/office/word/2020/wordml/sdtdatahash" xmlns:w16sdtfl="http://schemas.microsoft.com/office/word/2024/wordml/sdtformatlock" xmlns:w16se="http://schemas.microsoft.com/office/word/2015/wordml/symex" xmlns:wpg="http://schemas.microsoft.com/office/word/2010/wordprocessingGroup" xmlns:wpi="http://schemas.microsoft.com/office/word/2010/wordprocessingInk" xmlns:wne="http://schemas.microsoft.com/office/word/2006/wordml" xmlns:wps="http://schemas.microsoft.com/office/word/2010/wordprocessingShape" mc:Ignorable="w14 w15 w16se w16cid w16 w16cex w16sdtdh w16sdtfl w16du wp14">
-  <w15:person w15:author="Pooja.Bhat@NHAAD.IN">
+  <w15:person w15:author="NHA">
     <w15:presenceInfo w15:providerId="AD" w15:userId="S-1-5-21-924986020-3125860431-870378331-1169"/>
   </w15:person>
 </w15:people>

</xml_diff>